<commit_message>
feat: migrate to docxtpl for Word generation, support multi-line text and dynamic table control
</commit_message>
<xml_diff>
--- a/templates_docx/QoS模板.docx
+++ b/templates_docx/QoS模板.docx
@@ -9,12 +9,14 @@
       </w:pPr>
     </w:p>
     <w:p>
+      <w:proofErr w:type="gramStart"/>
       <w:r>
         <w:rPr>
           <w:rFonts w:hint="eastAsia"/>
         </w:rPr>
         <w:t>设表</w:t>
       </w:r>
+      <w:proofErr w:type="gramEnd"/>
       <w:r>
         <w:rPr>
           <w:rFonts w:hint="eastAsia"/>
@@ -106,12 +108,14 @@
         </w:rPr>
         <w:t xml:space="preserve">   </w:t>
       </w:r>
+      <w:proofErr w:type="gramStart"/>
       <w:r>
         <w:rPr>
           <w:rFonts w:hint="eastAsia"/>
         </w:rPr>
         <w:t>页共</w:t>
       </w:r>
+      <w:proofErr w:type="gramEnd"/>
       <w:r>
         <w:rPr>
           <w:rFonts w:hint="eastAsia"/>
@@ -194,28 +198,21 @@
             <w:vAlign w:val="center"/>
           </w:tcPr>
           <w:p>
-            <w:pPr>
-              <w:rPr>
-                <w:rFonts w:hint="eastAsia"/>
-              </w:rPr>
-            </w:pPr>
-            <w:r>
-              <w:rPr>
-                <w:rFonts w:hint="eastAsia"/>
-              </w:rPr>
-              <w:t>[[</w:t>
-            </w:r>
-            <w:r>
-              <w:rPr>
-                <w:rFonts w:hint="eastAsia"/>
-              </w:rPr>
-              <w:t>这里填写项目名称及阶段</w:t>
-            </w:r>
-            <w:r>
-              <w:rPr>
-                <w:rFonts w:hint="eastAsia"/>
-              </w:rPr>
-              <w:t>]]</w:t>
+            <w:proofErr w:type="gramStart"/>
+            <w:r>
+              <w:t xml:space="preserve">{{ </w:t>
+            </w:r>
+            <w:proofErr w:type="spellStart"/>
+            <w:r>
+              <w:t>project</w:t>
+            </w:r>
+            <w:proofErr w:type="gramEnd"/>
+            <w:r>
+              <w:t>_name</w:t>
+            </w:r>
+            <w:proofErr w:type="spellEnd"/>
+            <w:r>
+              <w:t xml:space="preserve"> }}</w:t>
             </w:r>
           </w:p>
         </w:tc>
@@ -261,29 +258,22 @@
             <w:pPr>
               <w:snapToGrid w:val="0"/>
               <w:jc w:val="left"/>
-              <w:rPr>
-                <w:rFonts w:hint="eastAsia"/>
-              </w:rPr>
-            </w:pPr>
-            <w:r>
-              <w:rPr>
-                <w:rFonts w:hint="eastAsia"/>
-              </w:rPr>
-              <w:t>[[</w:t>
-            </w:r>
-            <w:r>
-              <w:rPr>
-                <w:rFonts w:hint="eastAsia"/>
-                <w:szCs w:val="21"/>
-              </w:rPr>
-              <w:t>这里填写设计范围</w:t>
-            </w:r>
-            <w:r>
-              <w:rPr>
-                <w:rFonts w:hint="eastAsia"/>
-                <w:szCs w:val="21"/>
-              </w:rPr>
-              <w:t>]]</w:t>
+            </w:pPr>
+            <w:proofErr w:type="gramStart"/>
+            <w:r>
+              <w:t xml:space="preserve">{{ </w:t>
+            </w:r>
+            <w:proofErr w:type="spellStart"/>
+            <w:r>
+              <w:t>design</w:t>
+            </w:r>
+            <w:proofErr w:type="gramEnd"/>
+            <w:r>
+              <w:t>_range</w:t>
+            </w:r>
+            <w:proofErr w:type="spellEnd"/>
+            <w:r>
+              <w:t xml:space="preserve"> }}</w:t>
             </w:r>
           </w:p>
         </w:tc>
@@ -327,30 +317,34 @@
             <w:pPr>
               <w:snapToGrid w:val="0"/>
               <w:ind w:rightChars="-214" w:right="-449"/>
-              <w:rPr>
-                <w:rFonts w:hint="eastAsia"/>
-              </w:rPr>
-            </w:pPr>
-            <w:r>
-              <w:rPr>
-                <w:rFonts w:hint="eastAsia"/>
-                <w:szCs w:val="21"/>
-              </w:rPr>
-              <w:t>[[</w:t>
-            </w:r>
-            <w:r>
-              <w:rPr>
-                <w:rFonts w:hint="eastAsia"/>
-                <w:szCs w:val="21"/>
-              </w:rPr>
-              <w:t>这里填写完整图名或文件名</w:t>
-            </w:r>
-            <w:r>
-              <w:rPr>
-                <w:rFonts w:hint="eastAsia"/>
-                <w:szCs w:val="21"/>
-              </w:rPr>
-              <w:t>]]</w:t>
+            </w:pPr>
+            <w:proofErr w:type="gramStart"/>
+            <w:r>
+              <w:rPr>
+                <w:szCs w:val="21"/>
+              </w:rPr>
+              <w:t xml:space="preserve">{{ </w:t>
+            </w:r>
+            <w:proofErr w:type="spellStart"/>
+            <w:r>
+              <w:rPr>
+                <w:szCs w:val="21"/>
+              </w:rPr>
+              <w:t>file</w:t>
+            </w:r>
+            <w:proofErr w:type="gramEnd"/>
+            <w:r>
+              <w:rPr>
+                <w:szCs w:val="21"/>
+              </w:rPr>
+              <w:t>_name</w:t>
+            </w:r>
+            <w:proofErr w:type="spellEnd"/>
+            <w:r>
+              <w:rPr>
+                <w:szCs w:val="21"/>
+              </w:rPr>
+              <w:t xml:space="preserve"> }}</w:t>
             </w:r>
           </w:p>
         </w:tc>
@@ -384,27 +378,22 @@
             <w:pPr>
               <w:snapToGrid w:val="0"/>
               <w:jc w:val="left"/>
-              <w:rPr>
-                <w:rFonts w:hint="eastAsia"/>
-              </w:rPr>
-            </w:pPr>
-            <w:r>
-              <w:rPr>
-                <w:rFonts w:hint="eastAsia"/>
-              </w:rPr>
-              <w:t>[[</w:t>
-            </w:r>
-            <w:r>
-              <w:rPr>
-                <w:rFonts w:hint="eastAsia"/>
-              </w:rPr>
-              <w:t>这里填写张数</w:t>
-            </w:r>
-            <w:r>
-              <w:rPr>
-                <w:rFonts w:hint="eastAsia"/>
-              </w:rPr>
-              <w:t>]]</w:t>
+            </w:pPr>
+            <w:proofErr w:type="gramStart"/>
+            <w:r>
+              <w:t xml:space="preserve">{{ </w:t>
+            </w:r>
+            <w:proofErr w:type="spellStart"/>
+            <w:r>
+              <w:t>sheet</w:t>
+            </w:r>
+            <w:proofErr w:type="gramEnd"/>
+            <w:r>
+              <w:t>_count</w:t>
+            </w:r>
+            <w:proofErr w:type="spellEnd"/>
+            <w:r>
+              <w:t xml:space="preserve"> }}</w:t>
             </w:r>
           </w:p>
         </w:tc>
@@ -639,27 +628,22 @@
             <w:pPr>
               <w:adjustRightInd w:val="0"/>
               <w:snapToGrid w:val="0"/>
-              <w:rPr>
-                <w:rFonts w:hint="eastAsia"/>
-              </w:rPr>
-            </w:pPr>
-            <w:r>
-              <w:rPr>
-                <w:rFonts w:hint="eastAsia"/>
-              </w:rPr>
-              <w:t>[[</w:t>
-            </w:r>
-            <w:r>
-              <w:rPr>
-                <w:rFonts w:hint="eastAsia"/>
-              </w:rPr>
-              <w:t>这里填写复核意见</w:t>
-            </w:r>
-            <w:r>
-              <w:rPr>
-                <w:rFonts w:hint="eastAsia"/>
-              </w:rPr>
-              <w:t>]]</w:t>
+            </w:pPr>
+            <w:proofErr w:type="gramStart"/>
+            <w:r>
+              <w:t xml:space="preserve">{{ </w:t>
+            </w:r>
+            <w:proofErr w:type="spellStart"/>
+            <w:r>
+              <w:t>review</w:t>
+            </w:r>
+            <w:proofErr w:type="gramEnd"/>
+            <w:r>
+              <w:t>_opinions_text</w:t>
+            </w:r>
+            <w:proofErr w:type="spellEnd"/>
+            <w:r>
+              <w:t xml:space="preserve"> }}</w:t>
             </w:r>
           </w:p>
         </w:tc>
@@ -711,6 +695,7 @@
       <w:pPr>
         <w:snapToGrid w:val="0"/>
       </w:pPr>
+      <w:proofErr w:type="gramStart"/>
       <w:r>
         <w:rPr>
           <w:rFonts w:hint="eastAsia"/>
@@ -718,6 +703,7 @@
         <w:lastRenderedPageBreak/>
         <w:t>设表</w:t>
       </w:r>
+      <w:proofErr w:type="gramEnd"/>
       <w:r>
         <w:rPr>
           <w:rFonts w:hint="eastAsia"/>
@@ -1047,9 +1033,6 @@
             <w:pPr>
               <w:adjustRightInd w:val="0"/>
               <w:snapToGrid w:val="0"/>
-              <w:rPr>
-                <w:rFonts w:hint="eastAsia"/>
-              </w:rPr>
             </w:pPr>
           </w:p>
           <w:p>
@@ -1235,6 +1218,15 @@
             <w:pPr>
               <w:adjustRightInd w:val="0"/>
               <w:snapToGrid w:val="0"/>
+              <w:rPr>
+                <w:rFonts w:hint="eastAsia"/>
+              </w:rPr>
+            </w:pPr>
+          </w:p>
+          <w:p>
+            <w:pPr>
+              <w:adjustRightInd w:val="0"/>
+              <w:snapToGrid w:val="0"/>
             </w:pPr>
           </w:p>
           <w:p>
@@ -1266,13 +1258,6 @@
               </w:rPr>
               <w:t xml:space="preserve">           </w:t>
             </w:r>
-          </w:p>
-          <w:p>
-            <w:pPr>
-              <w:adjustRightInd w:val="0"/>
-              <w:snapToGrid w:val="0"/>
-              <w:ind w:firstLineChars="600" w:firstLine="1260"/>
-            </w:pPr>
             <w:r>
               <w:rPr>
                 <w:rFonts w:hint="eastAsia"/>
@@ -1424,6 +1409,7 @@
       <w:pPr>
         <w:snapToGrid w:val="0"/>
       </w:pPr>
+      <w:proofErr w:type="gramStart"/>
       <w:r>
         <w:rPr>
           <w:rFonts w:hint="eastAsia"/>
@@ -1431,6 +1417,7 @@
         <w:lastRenderedPageBreak/>
         <w:t>设表</w:t>
       </w:r>
+      <w:proofErr w:type="gramEnd"/>
       <w:r>
         <w:rPr>
           <w:rFonts w:hint="eastAsia"/>
@@ -1505,12 +1492,14 @@
         </w:rPr>
         <w:t xml:space="preserve">   </w:t>
       </w:r>
+      <w:proofErr w:type="gramStart"/>
       <w:r>
         <w:rPr>
           <w:rFonts w:hint="eastAsia"/>
         </w:rPr>
         <w:t>页共</w:t>
       </w:r>
+      <w:proofErr w:type="gramEnd"/>
       <w:r>
         <w:rPr>
           <w:rFonts w:hint="eastAsia"/>
@@ -1600,23 +1589,21 @@
                 <w:szCs w:val="21"/>
               </w:rPr>
             </w:pPr>
-            <w:r>
-              <w:rPr>
-                <w:rFonts w:hint="eastAsia"/>
-              </w:rPr>
-              <w:t>[[</w:t>
-            </w:r>
-            <w:r>
-              <w:rPr>
-                <w:rFonts w:hint="eastAsia"/>
-              </w:rPr>
-              <w:t>这里填写项目名称及阶段</w:t>
-            </w:r>
-            <w:r>
-              <w:rPr>
-                <w:rFonts w:hint="eastAsia"/>
-              </w:rPr>
-              <w:t>]]</w:t>
+            <w:proofErr w:type="gramStart"/>
+            <w:r>
+              <w:t xml:space="preserve">{{ </w:t>
+            </w:r>
+            <w:proofErr w:type="spellStart"/>
+            <w:r>
+              <w:t>project</w:t>
+            </w:r>
+            <w:proofErr w:type="gramEnd"/>
+            <w:r>
+              <w:t>_name</w:t>
+            </w:r>
+            <w:proofErr w:type="spellEnd"/>
+            <w:r>
+              <w:t xml:space="preserve"> }}</w:t>
             </w:r>
           </w:p>
         </w:tc>
@@ -1682,25 +1669,21 @@
                 <w:szCs w:val="21"/>
               </w:rPr>
             </w:pPr>
-            <w:r>
-              <w:rPr>
-                <w:rFonts w:hint="eastAsia"/>
-              </w:rPr>
-              <w:t>[[</w:t>
-            </w:r>
-            <w:r>
-              <w:rPr>
-                <w:rFonts w:hint="eastAsia"/>
-                <w:szCs w:val="21"/>
-              </w:rPr>
-              <w:t>这里填写设计范围</w:t>
-            </w:r>
-            <w:r>
-              <w:rPr>
-                <w:rFonts w:hint="eastAsia"/>
-                <w:szCs w:val="21"/>
-              </w:rPr>
-              <w:t>]]</w:t>
+            <w:proofErr w:type="gramStart"/>
+            <w:r>
+              <w:t xml:space="preserve">{{ </w:t>
+            </w:r>
+            <w:proofErr w:type="spellStart"/>
+            <w:r>
+              <w:t>design</w:t>
+            </w:r>
+            <w:proofErr w:type="gramEnd"/>
+            <w:r>
+              <w:t>_range</w:t>
+            </w:r>
+            <w:proofErr w:type="spellEnd"/>
+            <w:r>
+              <w:t xml:space="preserve"> }}</w:t>
             </w:r>
           </w:p>
         </w:tc>
@@ -1777,26 +1760,33 @@
                 <w:szCs w:val="21"/>
               </w:rPr>
             </w:pPr>
-            <w:r>
-              <w:rPr>
-                <w:rFonts w:hint="eastAsia"/>
-                <w:szCs w:val="21"/>
-              </w:rPr>
-              <w:t>[[</w:t>
-            </w:r>
-            <w:r>
-              <w:rPr>
-                <w:rFonts w:hint="eastAsia"/>
-                <w:szCs w:val="21"/>
-              </w:rPr>
-              <w:t>这里填写完整图名或文件名</w:t>
-            </w:r>
-            <w:r>
-              <w:rPr>
-                <w:rFonts w:hint="eastAsia"/>
-                <w:szCs w:val="21"/>
-              </w:rPr>
-              <w:t>]]</w:t>
+            <w:proofErr w:type="gramStart"/>
+            <w:r>
+              <w:rPr>
+                <w:szCs w:val="21"/>
+              </w:rPr>
+              <w:t xml:space="preserve">{{ </w:t>
+            </w:r>
+            <w:proofErr w:type="spellStart"/>
+            <w:r>
+              <w:rPr>
+                <w:szCs w:val="21"/>
+              </w:rPr>
+              <w:t>file</w:t>
+            </w:r>
+            <w:proofErr w:type="gramEnd"/>
+            <w:r>
+              <w:rPr>
+                <w:szCs w:val="21"/>
+              </w:rPr>
+              <w:t>_name</w:t>
+            </w:r>
+            <w:proofErr w:type="spellEnd"/>
+            <w:r>
+              <w:rPr>
+                <w:szCs w:val="21"/>
+              </w:rPr>
+              <w:t xml:space="preserve"> }}</w:t>
             </w:r>
           </w:p>
         </w:tc>
@@ -2052,30 +2042,49 @@
               <w:snapToGrid w:val="0"/>
               <w:jc w:val="center"/>
               <w:rPr>
-                <w:rFonts w:hint="eastAsia"/>
-                <w:szCs w:val="21"/>
-              </w:rPr>
-            </w:pPr>
-            <w:r>
-              <w:rPr>
-                <w:rFonts w:hint="eastAsia"/>
-                <w:szCs w:val="21"/>
-              </w:rPr>
-              <w:t>[[</w:t>
-            </w:r>
-            <w:r>
-              <w:rPr>
-                <w:rFonts w:hint="eastAsia"/>
-                <w:szCs w:val="21"/>
-              </w:rPr>
-              <w:t>这里填写终审级别</w:t>
-            </w:r>
-            <w:r>
-              <w:rPr>
-                <w:rFonts w:hint="eastAsia"/>
-                <w:szCs w:val="21"/>
-              </w:rPr>
-              <w:t>]]</w:t>
+                <w:szCs w:val="21"/>
+              </w:rPr>
+            </w:pPr>
+            <w:proofErr w:type="gramStart"/>
+            <w:r>
+              <w:rPr>
+                <w:rFonts w:hint="eastAsia"/>
+                <w:szCs w:val="21"/>
+              </w:rPr>
+              <w:t xml:space="preserve">{{ </w:t>
+            </w:r>
+            <w:proofErr w:type="spellStart"/>
+            <w:r>
+              <w:rPr>
+                <w:szCs w:val="21"/>
+              </w:rPr>
+              <w:t>final</w:t>
+            </w:r>
+            <w:proofErr w:type="gramEnd"/>
+            <w:r>
+              <w:rPr>
+                <w:szCs w:val="21"/>
+              </w:rPr>
+              <w:t>_audit_level</w:t>
+            </w:r>
+            <w:proofErr w:type="spellEnd"/>
+          </w:p>
+          <w:p>
+            <w:pPr>
+              <w:adjustRightInd w:val="0"/>
+              <w:snapToGrid w:val="0"/>
+              <w:jc w:val="center"/>
+              <w:rPr>
+                <w:rFonts w:hint="eastAsia"/>
+                <w:szCs w:val="21"/>
+              </w:rPr>
+            </w:pPr>
+            <w:r>
+              <w:rPr>
+                <w:rFonts w:hint="eastAsia"/>
+                <w:szCs w:val="21"/>
+              </w:rPr>
+              <w:t xml:space="preserve"> }}</w:t>
             </w:r>
           </w:p>
         </w:tc>
@@ -2148,44 +2157,14 @@
             <w:pPr>
               <w:wordWrap w:val="0"/>
             </w:pPr>
-            <w:r>
-              <w:rPr>
-                <w:rFonts w:hint="eastAsia"/>
-              </w:rPr>
-              <w:t>[[</w:t>
-            </w:r>
-            <w:r>
-              <w:rPr>
-                <w:rFonts w:hint="eastAsia"/>
-              </w:rPr>
-              <w:t>这里填写</w:t>
-            </w:r>
-            <w:r>
-              <w:rPr>
-                <w:rFonts w:hint="eastAsia"/>
-              </w:rPr>
-              <w:t>所所审</w:t>
-            </w:r>
-            <w:r>
-              <w:rPr>
-                <w:rFonts w:hint="eastAsia"/>
-              </w:rPr>
-              <w:t>意见</w:t>
-            </w:r>
-            <w:r>
-              <w:rPr>
-                <w:rFonts w:hint="eastAsia"/>
-              </w:rPr>
-              <w:t>]]</w:t>
-            </w:r>
-          </w:p>
-          <w:p>
-            <w:pPr>
-              <w:wordWrap w:val="0"/>
-              <w:rPr>
-                <w:rFonts w:hint="eastAsia"/>
-              </w:rPr>
-            </w:pPr>
+            <w:proofErr w:type="gramStart"/>
+            <w:r>
+              <w:t>{{ audit</w:t>
+            </w:r>
+            <w:proofErr w:type="gramEnd"/>
+            <w:r>
+              <w:t>_suoshi_text }}</w:t>
+            </w:r>
           </w:p>
         </w:tc>
         <w:tc>
@@ -2201,9 +2180,6 @@
           <w:p>
             <w:pPr>
               <w:wordWrap w:val="0"/>
-              <w:rPr>
-                <w:rFonts w:hint="eastAsia"/>
-              </w:rPr>
             </w:pPr>
           </w:p>
           <w:p/>
@@ -2311,11 +2287,12 @@
               <w:t xml:space="preserve">    </w:t>
             </w:r>
             <w:bookmarkStart w:id="1" w:name="OLE_LINK2"/>
-          </w:p>
-          <w:p>
-            <w:pPr>
-              <w:ind w:firstLineChars="700" w:firstLine="1470"/>
-            </w:pPr>
+            <w:r>
+              <w:rPr>
+                <w:rFonts w:hint="eastAsia"/>
+              </w:rPr>
+              <w:t xml:space="preserve">     </w:t>
+            </w:r>
             <w:r>
               <w:rPr>
                 <w:rFonts w:hint="eastAsia"/>
@@ -2368,8 +2345,16 @@
         <w:rPr>
           <w:rFonts w:hint="eastAsia"/>
         </w:rPr>
-        <w:t>设计文件（图纸）审查卡片有两种形式（设表</w:t>
-      </w:r>
+        <w:t>设计文件（图纸）审查卡片有两种形式（</w:t>
+      </w:r>
+      <w:proofErr w:type="gramStart"/>
+      <w:r>
+        <w:rPr>
+          <w:rFonts w:hint="eastAsia"/>
+        </w:rPr>
+        <w:t>设表</w:t>
+      </w:r>
+      <w:proofErr w:type="gramEnd"/>
       <w:r>
         <w:rPr>
           <w:rFonts w:hint="eastAsia"/>
@@ -2380,8 +2365,16 @@
         <w:rPr>
           <w:rFonts w:hint="eastAsia"/>
         </w:rPr>
-        <w:t>、设表</w:t>
-      </w:r>
+        <w:t>、</w:t>
+      </w:r>
+      <w:proofErr w:type="gramStart"/>
+      <w:r>
+        <w:rPr>
+          <w:rFonts w:hint="eastAsia"/>
+        </w:rPr>
+        <w:t>设表</w:t>
+      </w:r>
+      <w:proofErr w:type="gramEnd"/>
       <w:r>
         <w:rPr>
           <w:rFonts w:hint="eastAsia"/>
@@ -2441,8 +2434,73 @@
           <w:rFonts w:hint="eastAsia"/>
         </w:rPr>
         <w:lastRenderedPageBreak/>
+        <w:t xml:space="preserve">{%p if </w:t>
+      </w:r>
+      <w:proofErr w:type="spellStart"/>
+      <w:r>
+        <w:rPr>
+          <w:rFonts w:hint="eastAsia"/>
+        </w:rPr>
+        <w:t>final_audit_level</w:t>
+      </w:r>
+      <w:proofErr w:type="spellEnd"/>
+      <w:r>
+        <w:rPr>
+          <w:rFonts w:hint="eastAsia"/>
+        </w:rPr>
+        <w:t xml:space="preserve"> == '</w:t>
+      </w:r>
+      <w:r>
+        <w:rPr>
+          <w:rFonts w:hint="eastAsia"/>
+        </w:rPr>
+        <w:t>院级</w:t>
+      </w:r>
+      <w:r>
+        <w:rPr>
+          <w:rFonts w:hint="eastAsia"/>
+        </w:rPr>
+        <w:t xml:space="preserve">' or </w:t>
+      </w:r>
+      <w:proofErr w:type="spellStart"/>
+      <w:r>
+        <w:rPr>
+          <w:rFonts w:hint="eastAsia"/>
+        </w:rPr>
+        <w:t>final_audit_level</w:t>
+      </w:r>
+      <w:proofErr w:type="spellEnd"/>
+      <w:r>
+        <w:rPr>
+          <w:rFonts w:hint="eastAsia"/>
+        </w:rPr>
+        <w:t xml:space="preserve"> == '</w:t>
+      </w:r>
+      <w:r>
+        <w:rPr>
+          <w:rFonts w:hint="eastAsia"/>
+        </w:rPr>
+        <w:t>公司级</w:t>
+      </w:r>
+      <w:r>
+        <w:rPr>
+          <w:rFonts w:hint="eastAsia"/>
+        </w:rPr>
+        <w:t>' %}</w:t>
+      </w:r>
+    </w:p>
+    <w:p>
+      <w:pPr>
+        <w:snapToGrid w:val="0"/>
+      </w:pPr>
+      <w:proofErr w:type="gramStart"/>
+      <w:r>
+        <w:rPr>
+          <w:rFonts w:hint="eastAsia"/>
+        </w:rPr>
         <w:t>设表</w:t>
       </w:r>
+      <w:proofErr w:type="gramEnd"/>
       <w:r>
         <w:rPr>
           <w:rFonts w:hint="eastAsia"/>
@@ -2517,12 +2575,14 @@
         </w:rPr>
         <w:t xml:space="preserve">   </w:t>
       </w:r>
+      <w:proofErr w:type="gramStart"/>
       <w:r>
         <w:rPr>
           <w:rFonts w:hint="eastAsia"/>
         </w:rPr>
         <w:t>页共</w:t>
       </w:r>
+      <w:proofErr w:type="gramEnd"/>
       <w:r>
         <w:rPr>
           <w:rFonts w:hint="eastAsia"/>
@@ -2612,17 +2672,21 @@
                 <w:szCs w:val="21"/>
               </w:rPr>
             </w:pPr>
-            <w:r>
-              <w:t>[[</w:t>
-            </w:r>
-            <w:r>
-              <w:rPr>
-                <w:rFonts w:hint="eastAsia"/>
-              </w:rPr>
-              <w:t>这里填写项目名称及阶段</w:t>
-            </w:r>
-            <w:r>
-              <w:t>]]</w:t>
+            <w:proofErr w:type="gramStart"/>
+            <w:r>
+              <w:t xml:space="preserve">{{ </w:t>
+            </w:r>
+            <w:proofErr w:type="spellStart"/>
+            <w:r>
+              <w:t>project</w:t>
+            </w:r>
+            <w:proofErr w:type="gramEnd"/>
+            <w:r>
+              <w:t>_name</w:t>
+            </w:r>
+            <w:proofErr w:type="spellEnd"/>
+            <w:r>
+              <w:t xml:space="preserve"> }}</w:t>
             </w:r>
           </w:p>
         </w:tc>
@@ -2688,21 +2752,21 @@
                 <w:szCs w:val="21"/>
               </w:rPr>
             </w:pPr>
-            <w:r>
-              <w:t>[[</w:t>
-            </w:r>
-            <w:r>
-              <w:rPr>
-                <w:rFonts w:hint="eastAsia"/>
-                <w:szCs w:val="21"/>
-              </w:rPr>
-              <w:t>这里填写设计范围</w:t>
-            </w:r>
-            <w:r>
-              <w:rPr>
-                <w:szCs w:val="21"/>
-              </w:rPr>
-              <w:t>]]</w:t>
+            <w:proofErr w:type="gramStart"/>
+            <w:r>
+              <w:t xml:space="preserve">{{ </w:t>
+            </w:r>
+            <w:proofErr w:type="spellStart"/>
+            <w:r>
+              <w:t>design</w:t>
+            </w:r>
+            <w:proofErr w:type="gramEnd"/>
+            <w:r>
+              <w:t>_range</w:t>
+            </w:r>
+            <w:proofErr w:type="spellEnd"/>
+            <w:r>
+              <w:t xml:space="preserve"> }}</w:t>
             </w:r>
           </w:p>
         </w:tc>
@@ -2779,24 +2843,33 @@
                 <w:szCs w:val="21"/>
               </w:rPr>
             </w:pPr>
-            <w:r>
-              <w:rPr>
-                <w:szCs w:val="21"/>
-              </w:rPr>
-              <w:t>[[</w:t>
-            </w:r>
-            <w:r>
-              <w:rPr>
-                <w:rFonts w:hint="eastAsia"/>
-                <w:szCs w:val="21"/>
-              </w:rPr>
-              <w:t>这里填写完整图名或文件名</w:t>
-            </w:r>
-            <w:r>
-              <w:rPr>
-                <w:szCs w:val="21"/>
-              </w:rPr>
-              <w:t>]]</w:t>
+            <w:proofErr w:type="gramStart"/>
+            <w:r>
+              <w:rPr>
+                <w:szCs w:val="21"/>
+              </w:rPr>
+              <w:t xml:space="preserve">{{ </w:t>
+            </w:r>
+            <w:proofErr w:type="spellStart"/>
+            <w:r>
+              <w:rPr>
+                <w:szCs w:val="21"/>
+              </w:rPr>
+              <w:t>file</w:t>
+            </w:r>
+            <w:proofErr w:type="gramEnd"/>
+            <w:r>
+              <w:rPr>
+                <w:szCs w:val="21"/>
+              </w:rPr>
+              <w:t>_name</w:t>
+            </w:r>
+            <w:proofErr w:type="spellEnd"/>
+            <w:r>
+              <w:rPr>
+                <w:szCs w:val="21"/>
+              </w:rPr>
+              <w:t xml:space="preserve"> }}</w:t>
             </w:r>
           </w:p>
         </w:tc>
@@ -3054,26 +3127,45 @@
                 <w:szCs w:val="21"/>
               </w:rPr>
             </w:pPr>
-            <w:r>
-              <w:rPr>
-                <w:rFonts w:hint="eastAsia"/>
-                <w:szCs w:val="21"/>
-              </w:rPr>
-              <w:t>[[</w:t>
-            </w:r>
-            <w:r>
-              <w:rPr>
-                <w:rFonts w:hint="eastAsia"/>
-                <w:szCs w:val="21"/>
-              </w:rPr>
-              <w:t>这里填写终审级别</w:t>
-            </w:r>
-            <w:r>
-              <w:rPr>
-                <w:rFonts w:hint="eastAsia"/>
-                <w:szCs w:val="21"/>
-              </w:rPr>
-              <w:t>]]</w:t>
+            <w:proofErr w:type="gramStart"/>
+            <w:r>
+              <w:rPr>
+                <w:rFonts w:hint="eastAsia"/>
+                <w:szCs w:val="21"/>
+              </w:rPr>
+              <w:t xml:space="preserve">{{ </w:t>
+            </w:r>
+            <w:proofErr w:type="spellStart"/>
+            <w:r>
+              <w:rPr>
+                <w:szCs w:val="21"/>
+              </w:rPr>
+              <w:t>final</w:t>
+            </w:r>
+            <w:proofErr w:type="gramEnd"/>
+            <w:r>
+              <w:rPr>
+                <w:szCs w:val="21"/>
+              </w:rPr>
+              <w:t>_audit_level</w:t>
+            </w:r>
+            <w:proofErr w:type="spellEnd"/>
+          </w:p>
+          <w:p>
+            <w:pPr>
+              <w:adjustRightInd w:val="0"/>
+              <w:snapToGrid w:val="0"/>
+              <w:jc w:val="center"/>
+              <w:rPr>
+                <w:szCs w:val="21"/>
+              </w:rPr>
+            </w:pPr>
+            <w:r>
+              <w:rPr>
+                <w:rFonts w:hint="eastAsia"/>
+                <w:szCs w:val="21"/>
+              </w:rPr>
+              <w:t xml:space="preserve"> }}</w:t>
             </w:r>
           </w:p>
         </w:tc>
@@ -3135,7 +3227,7 @@
       </w:tr>
       <w:tr>
         <w:trPr>
-          <w:trHeight w:val="6869"/>
+          <w:trHeight w:val="7158"/>
         </w:trPr>
         <w:tc>
           <w:tcPr>
@@ -3145,56 +3237,26 @@
           <w:p>
             <w:pPr>
               <w:wordWrap w:val="0"/>
-            </w:pPr>
-            <w:r>
-              <w:t>[[</w:t>
-            </w:r>
-            <w:r>
-              <w:rPr>
-                <w:rFonts w:hint="eastAsia"/>
-              </w:rPr>
-              <w:t>这里填写</w:t>
-            </w:r>
-            <w:r>
-              <w:rPr>
-                <w:rFonts w:hint="eastAsia"/>
-              </w:rPr>
-              <w:t>院审审查</w:t>
-            </w:r>
-            <w:r>
-              <w:rPr>
-                <w:rFonts w:hint="eastAsia"/>
-              </w:rPr>
-              <w:t>意见</w:t>
-            </w:r>
-            <w:r>
-              <w:t>]]</w:t>
-            </w:r>
-          </w:p>
-          <w:p>
-            <w:pPr>
-              <w:wordWrap w:val="0"/>
-            </w:pPr>
-          </w:p>
-          <w:p>
-            <w:pPr>
-              <w:wordWrap w:val="0"/>
-            </w:pPr>
-          </w:p>
-          <w:p>
-            <w:pPr>
-              <w:wordWrap w:val="0"/>
-            </w:pPr>
-          </w:p>
-          <w:p>
-            <w:pPr>
-              <w:wordWrap w:val="0"/>
-            </w:pPr>
-          </w:p>
-          <w:p>
-            <w:pPr>
-              <w:wordWrap w:val="0"/>
-            </w:pPr>
+              <w:rPr>
+                <w:rFonts w:hint="eastAsia"/>
+              </w:rPr>
+            </w:pPr>
+            <w:proofErr w:type="gramStart"/>
+            <w:r>
+              <w:t xml:space="preserve">{{ </w:t>
+            </w:r>
+            <w:proofErr w:type="spellStart"/>
+            <w:r>
+              <w:t>audit</w:t>
+            </w:r>
+            <w:proofErr w:type="gramEnd"/>
+            <w:r>
+              <w:t>_yuan_text</w:t>
+            </w:r>
+            <w:proofErr w:type="spellEnd"/>
+            <w:r>
+              <w:t xml:space="preserve"> }}</w:t>
+            </w:r>
           </w:p>
         </w:tc>
         <w:tc>
@@ -3207,7 +3269,7 @@
       </w:tr>
       <w:tr>
         <w:trPr>
-          <w:trHeight w:hRule="exact" w:val="1155"/>
+          <w:trHeight w:hRule="exact" w:val="585"/>
         </w:trPr>
         <w:tc>
           <w:tcPr>
@@ -3288,11 +3350,12 @@
               </w:rPr>
               <w:t xml:space="preserve">    </w:t>
             </w:r>
-          </w:p>
-          <w:p>
-            <w:pPr>
-              <w:ind w:firstLineChars="700" w:firstLine="1470"/>
-            </w:pPr>
+            <w:r>
+              <w:rPr>
+                <w:rFonts w:hint="eastAsia"/>
+              </w:rPr>
+              <w:t xml:space="preserve">    </w:t>
+            </w:r>
             <w:r>
               <w:rPr>
                 <w:rFonts w:hint="eastAsia"/>
@@ -3344,8 +3407,16 @@
         <w:rPr>
           <w:rFonts w:hint="eastAsia"/>
         </w:rPr>
-        <w:t>设计文件（图纸）审查卡片有两种形式（设表</w:t>
-      </w:r>
+        <w:t>设计文件（图纸）审查卡片有两种形式（</w:t>
+      </w:r>
+      <w:proofErr w:type="gramStart"/>
+      <w:r>
+        <w:rPr>
+          <w:rFonts w:hint="eastAsia"/>
+        </w:rPr>
+        <w:t>设表</w:t>
+      </w:r>
+      <w:proofErr w:type="gramEnd"/>
       <w:r>
         <w:rPr>
           <w:rFonts w:hint="eastAsia"/>
@@ -3356,8 +3427,16 @@
         <w:rPr>
           <w:rFonts w:hint="eastAsia"/>
         </w:rPr>
-        <w:t>、设表</w:t>
-      </w:r>
+        <w:t>、</w:t>
+      </w:r>
+      <w:proofErr w:type="gramStart"/>
+      <w:r>
+        <w:rPr>
+          <w:rFonts w:hint="eastAsia"/>
+        </w:rPr>
+        <w:t>设表</w:t>
+      </w:r>
+      <w:proofErr w:type="gramEnd"/>
       <w:r>
         <w:rPr>
           <w:rFonts w:hint="eastAsia"/>
@@ -3407,11 +3486,10 @@
     </w:p>
     <w:p>
       <w:pPr>
-        <w:widowControl/>
-        <w:jc w:val="left"/>
+        <w:ind w:firstLineChars="200" w:firstLine="420"/>
       </w:pPr>
       <w:r>
-        <w:br w:type="page"/>
+        <w:t>{%p endif %}</w:t>
       </w:r>
     </w:p>
     <w:p>
@@ -3423,8 +3501,47 @@
           <w:rFonts w:hint="eastAsia"/>
         </w:rPr>
         <w:lastRenderedPageBreak/>
+        <w:t xml:space="preserve">{%p if </w:t>
+      </w:r>
+      <w:proofErr w:type="spellStart"/>
+      <w:r>
+        <w:rPr>
+          <w:rFonts w:hint="eastAsia"/>
+        </w:rPr>
+        <w:t>final_audit_level</w:t>
+      </w:r>
+      <w:proofErr w:type="spellEnd"/>
+      <w:r>
+        <w:rPr>
+          <w:rFonts w:hint="eastAsia"/>
+        </w:rPr>
+        <w:t xml:space="preserve"> == '</w:t>
+      </w:r>
+      <w:r>
+        <w:rPr>
+          <w:rFonts w:hint="eastAsia"/>
+        </w:rPr>
+        <w:t>公司级</w:t>
+      </w:r>
+      <w:r>
+        <w:rPr>
+          <w:rFonts w:hint="eastAsia"/>
+        </w:rPr>
+        <w:t>' %}</w:t>
+      </w:r>
+    </w:p>
+    <w:p>
+      <w:pPr>
+        <w:snapToGrid w:val="0"/>
+      </w:pPr>
+      <w:proofErr w:type="gramStart"/>
+      <w:r>
+        <w:rPr>
+          <w:rFonts w:hint="eastAsia"/>
+        </w:rPr>
         <w:t>设表</w:t>
       </w:r>
+      <w:proofErr w:type="gramEnd"/>
       <w:r>
         <w:rPr>
           <w:rFonts w:hint="eastAsia"/>
@@ -3499,12 +3616,14 @@
         </w:rPr>
         <w:t xml:space="preserve">   </w:t>
       </w:r>
+      <w:proofErr w:type="gramStart"/>
       <w:r>
         <w:rPr>
           <w:rFonts w:hint="eastAsia"/>
         </w:rPr>
         <w:t>页共</w:t>
       </w:r>
+      <w:proofErr w:type="gramEnd"/>
       <w:r>
         <w:rPr>
           <w:rFonts w:hint="eastAsia"/>
@@ -3594,17 +3713,21 @@
                 <w:szCs w:val="21"/>
               </w:rPr>
             </w:pPr>
-            <w:r>
-              <w:t>[[</w:t>
-            </w:r>
-            <w:r>
-              <w:rPr>
-                <w:rFonts w:hint="eastAsia"/>
-              </w:rPr>
-              <w:t>这里填写项目名称及阶段</w:t>
-            </w:r>
-            <w:r>
-              <w:t>]]</w:t>
+            <w:proofErr w:type="gramStart"/>
+            <w:r>
+              <w:t xml:space="preserve">{{ </w:t>
+            </w:r>
+            <w:proofErr w:type="spellStart"/>
+            <w:r>
+              <w:t>project</w:t>
+            </w:r>
+            <w:proofErr w:type="gramEnd"/>
+            <w:r>
+              <w:t>_name</w:t>
+            </w:r>
+            <w:proofErr w:type="spellEnd"/>
+            <w:r>
+              <w:t xml:space="preserve"> }}</w:t>
             </w:r>
           </w:p>
         </w:tc>
@@ -3670,21 +3793,21 @@
                 <w:szCs w:val="21"/>
               </w:rPr>
             </w:pPr>
-            <w:r>
-              <w:t>[[</w:t>
-            </w:r>
-            <w:r>
-              <w:rPr>
-                <w:rFonts w:hint="eastAsia"/>
-                <w:szCs w:val="21"/>
-              </w:rPr>
-              <w:t>这里填写设计范围</w:t>
-            </w:r>
-            <w:r>
-              <w:rPr>
-                <w:szCs w:val="21"/>
-              </w:rPr>
-              <w:t>]]</w:t>
+            <w:proofErr w:type="gramStart"/>
+            <w:r>
+              <w:t xml:space="preserve">{{ </w:t>
+            </w:r>
+            <w:proofErr w:type="spellStart"/>
+            <w:r>
+              <w:t>design</w:t>
+            </w:r>
+            <w:proofErr w:type="gramEnd"/>
+            <w:r>
+              <w:t>_range</w:t>
+            </w:r>
+            <w:proofErr w:type="spellEnd"/>
+            <w:r>
+              <w:t xml:space="preserve"> }}</w:t>
             </w:r>
           </w:p>
         </w:tc>
@@ -3761,24 +3884,33 @@
                 <w:szCs w:val="21"/>
               </w:rPr>
             </w:pPr>
-            <w:r>
-              <w:rPr>
-                <w:szCs w:val="21"/>
-              </w:rPr>
-              <w:t>[[</w:t>
-            </w:r>
-            <w:r>
-              <w:rPr>
-                <w:rFonts w:hint="eastAsia"/>
-                <w:szCs w:val="21"/>
-              </w:rPr>
-              <w:t>这里填写完整图名或文件名</w:t>
-            </w:r>
-            <w:r>
-              <w:rPr>
-                <w:szCs w:val="21"/>
-              </w:rPr>
-              <w:t>]]</w:t>
+            <w:proofErr w:type="gramStart"/>
+            <w:r>
+              <w:rPr>
+                <w:szCs w:val="21"/>
+              </w:rPr>
+              <w:t xml:space="preserve">{{ </w:t>
+            </w:r>
+            <w:proofErr w:type="spellStart"/>
+            <w:r>
+              <w:rPr>
+                <w:szCs w:val="21"/>
+              </w:rPr>
+              <w:t>file</w:t>
+            </w:r>
+            <w:proofErr w:type="gramEnd"/>
+            <w:r>
+              <w:rPr>
+                <w:szCs w:val="21"/>
+              </w:rPr>
+              <w:t>_name</w:t>
+            </w:r>
+            <w:proofErr w:type="spellEnd"/>
+            <w:r>
+              <w:rPr>
+                <w:szCs w:val="21"/>
+              </w:rPr>
+              <w:t xml:space="preserve"> }}</w:t>
             </w:r>
           </w:p>
         </w:tc>
@@ -4036,26 +4168,45 @@
                 <w:szCs w:val="21"/>
               </w:rPr>
             </w:pPr>
-            <w:r>
-              <w:rPr>
-                <w:rFonts w:hint="eastAsia"/>
-                <w:szCs w:val="21"/>
-              </w:rPr>
-              <w:t>[[</w:t>
-            </w:r>
-            <w:r>
-              <w:rPr>
-                <w:rFonts w:hint="eastAsia"/>
-                <w:szCs w:val="21"/>
-              </w:rPr>
-              <w:t>这里填写终审级别</w:t>
-            </w:r>
-            <w:r>
-              <w:rPr>
-                <w:rFonts w:hint="eastAsia"/>
-                <w:szCs w:val="21"/>
-              </w:rPr>
-              <w:t>]]</w:t>
+            <w:proofErr w:type="gramStart"/>
+            <w:r>
+              <w:rPr>
+                <w:rFonts w:hint="eastAsia"/>
+                <w:szCs w:val="21"/>
+              </w:rPr>
+              <w:t xml:space="preserve">{{ </w:t>
+            </w:r>
+            <w:proofErr w:type="spellStart"/>
+            <w:r>
+              <w:rPr>
+                <w:szCs w:val="21"/>
+              </w:rPr>
+              <w:t>final</w:t>
+            </w:r>
+            <w:proofErr w:type="gramEnd"/>
+            <w:r>
+              <w:rPr>
+                <w:szCs w:val="21"/>
+              </w:rPr>
+              <w:t>_audit_level</w:t>
+            </w:r>
+            <w:proofErr w:type="spellEnd"/>
+          </w:p>
+          <w:p>
+            <w:pPr>
+              <w:adjustRightInd w:val="0"/>
+              <w:snapToGrid w:val="0"/>
+              <w:jc w:val="center"/>
+              <w:rPr>
+                <w:szCs w:val="21"/>
+              </w:rPr>
+            </w:pPr>
+            <w:r>
+              <w:rPr>
+                <w:rFonts w:hint="eastAsia"/>
+                <w:szCs w:val="21"/>
+              </w:rPr>
+              <w:t xml:space="preserve"> }}</w:t>
             </w:r>
           </w:p>
         </w:tc>
@@ -4117,7 +4268,7 @@
       </w:tr>
       <w:tr>
         <w:trPr>
-          <w:trHeight w:val="7153"/>
+          <w:trHeight w:val="7295"/>
         </w:trPr>
         <w:tc>
           <w:tcPr>
@@ -4126,143 +4277,28 @@
           </w:tcPr>
           <w:p>
             <w:pPr>
-              <w:wordWrap w:val="0"/>
-            </w:pPr>
-            <w:r>
-              <w:t>[[</w:t>
-            </w:r>
-            <w:r>
-              <w:rPr>
-                <w:rFonts w:hint="eastAsia"/>
-              </w:rPr>
-              <w:t>这里填写</w:t>
-            </w:r>
-            <w:r>
-              <w:rPr>
-                <w:rFonts w:hint="eastAsia"/>
-              </w:rPr>
-              <w:t>公司</w:t>
-            </w:r>
-            <w:r>
-              <w:rPr>
-                <w:rFonts w:hint="eastAsia"/>
-              </w:rPr>
-              <w:t>审审查</w:t>
-            </w:r>
-            <w:r>
-              <w:rPr>
-                <w:rFonts w:hint="eastAsia"/>
-              </w:rPr>
-              <w:t>意见</w:t>
-            </w:r>
-            <w:r>
-              <w:t>]]</w:t>
-            </w:r>
-          </w:p>
-          <w:p>
-            <w:pPr>
-              <w:adjustRightInd w:val="0"/>
-              <w:snapToGrid w:val="0"/>
-              <w:rPr>
-                <w:rFonts w:hint="eastAsia"/>
-              </w:rPr>
-            </w:pPr>
-          </w:p>
-          <w:p>
-            <w:pPr>
-              <w:adjustRightInd w:val="0"/>
-              <w:snapToGrid w:val="0"/>
-            </w:pPr>
-          </w:p>
-          <w:p>
-            <w:pPr>
-              <w:adjustRightInd w:val="0"/>
-              <w:snapToGrid w:val="0"/>
-            </w:pPr>
-          </w:p>
-          <w:p>
-            <w:pPr>
-              <w:adjustRightInd w:val="0"/>
-              <w:snapToGrid w:val="0"/>
-            </w:pPr>
-          </w:p>
-          <w:p>
-            <w:pPr>
-              <w:adjustRightInd w:val="0"/>
-              <w:snapToGrid w:val="0"/>
-            </w:pPr>
-          </w:p>
-          <w:p>
-            <w:pPr>
-              <w:adjustRightInd w:val="0"/>
-              <w:snapToGrid w:val="0"/>
-            </w:pPr>
-          </w:p>
-          <w:p>
-            <w:pPr>
-              <w:adjustRightInd w:val="0"/>
-              <w:snapToGrid w:val="0"/>
-            </w:pPr>
-          </w:p>
-          <w:p>
-            <w:pPr>
-              <w:adjustRightInd w:val="0"/>
-              <w:snapToGrid w:val="0"/>
-            </w:pPr>
-          </w:p>
-          <w:p>
-            <w:pPr>
-              <w:adjustRightInd w:val="0"/>
-              <w:snapToGrid w:val="0"/>
-            </w:pPr>
-          </w:p>
-          <w:p>
-            <w:pPr>
-              <w:adjustRightInd w:val="0"/>
-              <w:snapToGrid w:val="0"/>
-            </w:pPr>
-          </w:p>
-          <w:p>
-            <w:pPr>
-              <w:adjustRightInd w:val="0"/>
-              <w:snapToGrid w:val="0"/>
-            </w:pPr>
-          </w:p>
-          <w:p>
-            <w:pPr>
-              <w:adjustRightInd w:val="0"/>
-              <w:snapToGrid w:val="0"/>
-            </w:pPr>
-          </w:p>
-          <w:p>
-            <w:pPr>
-              <w:adjustRightInd w:val="0"/>
-              <w:snapToGrid w:val="0"/>
-            </w:pPr>
-          </w:p>
-          <w:p>
-            <w:pPr>
-              <w:adjustRightInd w:val="0"/>
-              <w:snapToGrid w:val="0"/>
-            </w:pPr>
-          </w:p>
-          <w:p>
-            <w:pPr>
-              <w:adjustRightInd w:val="0"/>
-              <w:snapToGrid w:val="0"/>
-            </w:pPr>
-          </w:p>
-          <w:p>
-            <w:pPr>
-              <w:adjustRightInd w:val="0"/>
-              <w:snapToGrid w:val="0"/>
-            </w:pPr>
-          </w:p>
-          <w:p>
-            <w:pPr>
-              <w:adjustRightInd w:val="0"/>
-              <w:snapToGrid w:val="0"/>
-            </w:pPr>
+              <w:adjustRightInd w:val="0"/>
+              <w:snapToGrid w:val="0"/>
+              <w:rPr>
+                <w:rFonts w:hint="eastAsia"/>
+              </w:rPr>
+            </w:pPr>
+            <w:proofErr w:type="gramStart"/>
+            <w:r>
+              <w:t xml:space="preserve">{{ </w:t>
+            </w:r>
+            <w:proofErr w:type="spellStart"/>
+            <w:r>
+              <w:t>audit</w:t>
+            </w:r>
+            <w:proofErr w:type="gramEnd"/>
+            <w:r>
+              <w:t>_gongsi_text</w:t>
+            </w:r>
+            <w:proofErr w:type="spellEnd"/>
+            <w:r>
+              <w:t xml:space="preserve"> }}</w:t>
+            </w:r>
           </w:p>
         </w:tc>
         <w:tc>
@@ -4275,7 +4311,7 @@
       </w:tr>
       <w:tr>
         <w:trPr>
-          <w:trHeight w:hRule="exact" w:val="1155"/>
+          <w:trHeight w:hRule="exact" w:val="591"/>
         </w:trPr>
         <w:tc>
           <w:tcPr>
@@ -4356,11 +4392,12 @@
               </w:rPr>
               <w:t xml:space="preserve">    </w:t>
             </w:r>
-          </w:p>
-          <w:p>
-            <w:pPr>
-              <w:ind w:firstLineChars="700" w:firstLine="1470"/>
-            </w:pPr>
+            <w:r>
+              <w:rPr>
+                <w:rFonts w:hint="eastAsia"/>
+              </w:rPr>
+              <w:t xml:space="preserve">     </w:t>
+            </w:r>
             <w:r>
               <w:rPr>
                 <w:rFonts w:hint="eastAsia"/>
@@ -4412,8 +4449,16 @@
         <w:rPr>
           <w:rFonts w:hint="eastAsia"/>
         </w:rPr>
-        <w:t>设计文件（图纸）审查卡片有两种形式（设表</w:t>
-      </w:r>
+        <w:t>设计文件（图纸）审查卡片有两种形式（</w:t>
+      </w:r>
+      <w:proofErr w:type="gramStart"/>
+      <w:r>
+        <w:rPr>
+          <w:rFonts w:hint="eastAsia"/>
+        </w:rPr>
+        <w:t>设表</w:t>
+      </w:r>
+      <w:proofErr w:type="gramEnd"/>
       <w:r>
         <w:rPr>
           <w:rFonts w:hint="eastAsia"/>
@@ -4424,8 +4469,16 @@
         <w:rPr>
           <w:rFonts w:hint="eastAsia"/>
         </w:rPr>
-        <w:t>、设表</w:t>
-      </w:r>
+        <w:t>、</w:t>
+      </w:r>
+      <w:proofErr w:type="gramStart"/>
+      <w:r>
+        <w:rPr>
+          <w:rFonts w:hint="eastAsia"/>
+        </w:rPr>
+        <w:t>设表</w:t>
+      </w:r>
+      <w:proofErr w:type="gramEnd"/>
       <w:r>
         <w:rPr>
           <w:rFonts w:hint="eastAsia"/>
@@ -4471,6 +4524,14 @@
           <w:rFonts w:hint="eastAsia"/>
         </w:rPr>
         <w:t>各级审查人员对设计修改意见认可后，在设计文件、图纸上签署。</w:t>
+      </w:r>
+    </w:p>
+    <w:p>
+      <w:pPr>
+        <w:ind w:firstLineChars="200" w:firstLine="420"/>
+      </w:pPr>
+      <w:r>
+        <w:t>{%p endif %}</w:t>
       </w:r>
     </w:p>
     <w:sectPr>
@@ -5293,7 +5354,7 @@
   <w:style w:type="paragraph" w:default="1" w:styleId="a">
     <w:name w:val="Normal"/>
     <w:qFormat/>
-    <w:rsid w:val="0021569C"/>
+    <w:rsid w:val="001C293E"/>
     <w:pPr>
       <w:widowControl w:val="0"/>
       <w:jc w:val="both"/>

</xml_diff>